<commit_message>
feat: add Hebrew document template
</commit_message>
<xml_diff>
--- a/templates/hebrew_template.docx
+++ b/templates/hebrew_template.docx
@@ -69,9 +69,10 @@
   <w:p>
     <w:pPr>
       <w:spacing w:line="256" w:lineRule="auto"/>
-      <w:jc w:val="both"/>
+      <w:jc w:val="center"/>
       <w:rPr>
         <w:rFonts w:ascii="Calibri" w:eastAsia="Calibri" w:hAnsi="Calibri"/>
+        <w:color w:val="7F7F7F" w:themeColor="text1" w:themeTint="80"/>
         <w:kern w:val="0"/>
         <w:sz w:val="28"/>
         <w:szCs w:val="28"/>
@@ -85,6 +86,7 @@
         <w:rFonts w:ascii="Calibri" w:eastAsia="Calibri" w:hAnsi="Calibri"/>
         <w:b/>
         <w:bCs/>
+        <w:color w:val="7F7F7F" w:themeColor="text1" w:themeTint="80"/>
         <w:kern w:val="0"/>
         <w:sz w:val="32"/>
         <w:szCs w:val="32"/>
@@ -100,6 +102,7 @@
         <w:rFonts w:ascii="Calibri" w:eastAsia="Calibri" w:hAnsi="Calibri"/>
         <w:b/>
         <w:bCs/>
+        <w:color w:val="7F7F7F" w:themeColor="text1" w:themeTint="80"/>
         <w:kern w:val="0"/>
         <w:sz w:val="32"/>
         <w:szCs w:val="32"/>
@@ -115,6 +118,7 @@
         <w:rFonts w:ascii="Calibri" w:eastAsia="Calibri" w:hAnsi="Calibri"/>
         <w:b/>
         <w:bCs/>
+        <w:color w:val="7F7F7F" w:themeColor="text1" w:themeTint="80"/>
         <w:kern w:val="0"/>
         <w:sz w:val="32"/>
         <w:szCs w:val="32"/>
@@ -130,6 +134,7 @@
         <w:rFonts w:ascii="Calibri" w:eastAsia="Calibri" w:hAnsi="Calibri"/>
         <w:b/>
         <w:bCs/>
+        <w:color w:val="7F7F7F" w:themeColor="text1" w:themeTint="80"/>
         <w:kern w:val="0"/>
         <w:sz w:val="32"/>
         <w:szCs w:val="32"/>
@@ -144,6 +149,7 @@
         <w:rFonts w:ascii="Calibri" w:eastAsia="Calibri" w:hAnsi="Calibri"/>
         <w:b/>
         <w:bCs/>
+        <w:color w:val="7F7F7F" w:themeColor="text1" w:themeTint="80"/>
         <w:kern w:val="0"/>
         <w:sz w:val="28"/>
         <w:szCs w:val="28"/>
@@ -156,6 +162,7 @@
     <w:r>
       <w:rPr>
         <w:rFonts w:ascii="Calibri" w:eastAsia="Calibri" w:hAnsi="Calibri"/>
+        <w:color w:val="7F7F7F" w:themeColor="text1" w:themeTint="80"/>
         <w:kern w:val="0"/>
         <w:sz w:val="28"/>
         <w:szCs w:val="28"/>
@@ -169,6 +176,7 @@
     <w:r>
       <w:rPr>
         <w:rFonts w:ascii="Calibri" w:eastAsia="Calibri" w:hAnsi="Calibri"/>
+        <w:color w:val="7F7F7F" w:themeColor="text1" w:themeTint="80"/>
         <w:kern w:val="0"/>
         <w:sz w:val="28"/>
         <w:szCs w:val="28"/>
@@ -182,6 +190,7 @@
     <w:r>
       <w:rPr>
         <w:rFonts w:ascii="Calibri" w:eastAsia="Calibri" w:hAnsi="Calibri"/>
+        <w:color w:val="7F7F7F" w:themeColor="text1" w:themeTint="80"/>
         <w:kern w:val="0"/>
         <w:sz w:val="28"/>
         <w:szCs w:val="28"/>
@@ -195,6 +204,7 @@
     <w:r>
       <w:rPr>
         <w:rFonts w:ascii="Calibri" w:eastAsia="Calibri" w:hAnsi="Calibri"/>
+        <w:color w:val="7F7F7F" w:themeColor="text1" w:themeTint="80"/>
         <w:kern w:val="0"/>
         <w:sz w:val="28"/>
         <w:szCs w:val="28"/>
@@ -208,6 +218,7 @@
     <w:r>
       <w:rPr>
         <w:rFonts w:ascii="Calibri" w:eastAsia="Calibri" w:hAnsi="Calibri"/>
+        <w:color w:val="7F7F7F" w:themeColor="text1" w:themeTint="80"/>
         <w:kern w:val="0"/>
         <w:sz w:val="28"/>
         <w:szCs w:val="28"/>
@@ -215,7 +226,7 @@
         <w:lang w:val="en-US"/>
         <w14:ligatures w14:val="none"/>
       </w:rPr>
-      <w:t xml:space="preserve"> והסקה                                   </w:t>
+      <w:t xml:space="preserve"> והסקה</w:t>
     </w:r>
   </w:p>
   <w:p>
@@ -227,6 +238,7 @@
       <w:rPr>
         <w:rFonts w:ascii="Times New Roman" w:eastAsia="Times New Roman" w:hAnsi="Times New Roman" w:cs="David"/>
         <w:noProof/>
+        <w:color w:val="7F7F7F" w:themeColor="text1" w:themeTint="80"/>
         <w:kern w:val="0"/>
         <w:sz w:val="28"/>
         <w:szCs w:val="28"/>
@@ -239,6 +251,7 @@
       <w:rPr>
         <w:rFonts w:ascii="Times New Roman" w:eastAsia="Times New Roman" w:hAnsi="Times New Roman" w:cs="David"/>
         <w:noProof/>
+        <w:color w:val="7F7F7F" w:themeColor="text1" w:themeTint="80"/>
         <w:kern w:val="0"/>
         <w:sz w:val="28"/>
         <w:szCs w:val="28"/>
@@ -255,6 +268,7 @@
       <w:jc w:val="center"/>
       <w:rPr>
         <w:rFonts w:ascii="Calibri" w:eastAsia="Calibri" w:hAnsi="Calibri"/>
+        <w:color w:val="7F7F7F" w:themeColor="text1" w:themeTint="80"/>
         <w:kern w:val="0"/>
         <w:sz w:val="28"/>
         <w:szCs w:val="28"/>
@@ -265,6 +279,7 @@
     <w:r>
       <w:rPr>
         <w:rFonts w:ascii="Calibri" w:eastAsia="Calibri" w:hAnsi="Calibri"/>
+        <w:color w:val="7F7F7F" w:themeColor="text1" w:themeTint="80"/>
         <w:kern w:val="0"/>
         <w:sz w:val="28"/>
         <w:szCs w:val="28"/>
@@ -1187,6 +1202,7 @@
   <w:style w:type="character" w:default="1" w:styleId="DefaultParagraphFont">
     <w:name w:val="Default Paragraph Font"/>
     <w:uiPriority w:val="1"/>
+    <w:semiHidden/>
     <w:unhideWhenUsed/>
   </w:style>
   <w:style w:type="table" w:default="1" w:styleId="TableNormal">

</xml_diff>